<commit_message>
Retire la configuration Django de la documentation
</commit_message>
<xml_diff>
--- a/docs/fiche_procedure_sae_drive.docx
+++ b/docs/fiche_procedure_sae_drive.docx
@@ -741,43 +741,9 @@
       <w:pPr>
         <w:pStyle w:val="Heading1"/>
       </w:pPr>
+      <w:r/>
       <w:r>
-        <w:t>7. Configuration Django</w:t>
-      </w:r>
-    </w:p>
-    <w:p>
-      <w:r>
-        <w:t>La connexion entre Django et MySQL est configuree dans Sae203/Sae203/settings.py.</w:t>
-      </w:r>
-    </w:p>
-    <w:p>
-      <w:pPr>
-        <w:spacing w:after="120"/>
-        <w:ind w:left="360"/>
-      </w:pPr>
-      <w:r>
-        <w:rPr>
-          <w:rFonts w:ascii="Consolas" w:hAnsi="Consolas"/>
-          <w:color w:val="282828"/>
-          <w:sz w:val="18"/>
-        </w:rPr>
-        <w:t>ENGINE: django.db.backends.mysql</w:t>
-        <w:br/>
-        <w:t>NAME: sae_drive</w:t>
-        <w:br/>
-        <w:t>USER: root</w:t>
-        <w:br/>
-        <w:t>HOST: localhost</w:t>
-        <w:br/>
-        <w:t>PORT: 3306</w:t>
-      </w:r>
-    </w:p>
-    <w:p>
-      <w:pPr>
-        <w:pStyle w:val="Heading1"/>
-      </w:pPr>
-      <w:r>
-        <w:t>8. Installation de l'application</w:t>
+        <w:t>7. Installation de l'application</w:t>
       </w:r>
     </w:p>
     <w:p>
@@ -824,8 +790,9 @@
       <w:pPr>
         <w:pStyle w:val="Heading1"/>
       </w:pPr>
+      <w:r/>
       <w:r>
-        <w:t>9. Lancement du site</w:t>
+        <w:t>8. Lancement du site</w:t>
       </w:r>
     </w:p>
     <w:p>
@@ -875,8 +842,9 @@
       <w:pPr>
         <w:pStyle w:val="Heading1"/>
       </w:pPr>
+      <w:r/>
       <w:r>
-        <w:t>10. Tests a effectuer</w:t>
+        <w:t>9. Tests a effectuer</w:t>
       </w:r>
     </w:p>
     <w:p>
@@ -955,8 +923,9 @@
       <w:pPr>
         <w:pStyle w:val="Heading1"/>
       </w:pPr>
+      <w:r/>
       <w:r>
-        <w:t>11. Repartition des taches</w:t>
+        <w:t>10. Repartition des taches</w:t>
       </w:r>
     </w:p>
     <w:tbl>
@@ -1122,8 +1091,9 @@
       <w:pPr>
         <w:pStyle w:val="Heading1"/>
       </w:pPr>
+      <w:r/>
       <w:r>
-        <w:t>12. Conclusion</w:t>
+        <w:t>11. Conclusion</w:t>
       </w:r>
     </w:p>
     <w:p>

</xml_diff>